<commit_message>
Fix NOA master - BETWEEN spacing
</commit_message>
<xml_diff>
--- a/masters/NoticeOfActing.docx
+++ b/masters/NoticeOfActing.docx
@@ -105,26 +105,6 @@
     <w:p>
       <w:pPr>
         <w:tabs>
-          <w:tab w:val="left" w:pos="6667"/>
-        </w:tabs>
-        <w:rPr>
-          <w:rFonts w:ascii="Optima" w:hAnsi="Optima" w:cs="Arial"/>
-        </w:rPr>
-      </w:pPr>
-    </w:p>
-    <w:p>
-      <w:pPr>
-        <w:tabs>
-          <w:tab w:val="left" w:pos="204"/>
-        </w:tabs>
-        <w:rPr>
-          <w:rFonts w:ascii="Optima" w:hAnsi="Optima" w:cs="Arial"/>
-        </w:rPr>
-      </w:pPr>
-    </w:p>
-    <w:p>
-      <w:pPr>
-        <w:tabs>
           <w:tab w:val="left" w:pos="204"/>
         </w:tabs>
         <w:rPr>
@@ -221,7 +201,6 @@
         <w:tabs>
           <w:tab w:val="left" w:pos="8107"/>
         </w:tabs>
-        <w:jc w:val="right"/>
         <w:rPr>
           <w:rFonts w:ascii="Optima" w:hAnsi="Optima" w:cs="Arial"/>
         </w:rPr>
@@ -438,19 +417,7 @@
         <w:rPr>
           <w:rFonts w:ascii="Optima" w:hAnsi="Optima" w:cs="Arial"/>
         </w:rPr>
-        <w:t>that</w:t>
-      </w:r>
-      <w:r>
-        <w:rPr>
-          <w:rFonts w:ascii="Optima" w:hAnsi="Optima" w:cs="Arial"/>
-        </w:rPr>
-        <w:t xml:space="preserve"> </w:t>
-      </w:r>
-      <w:r>
-        <w:rPr>
-          <w:rFonts w:ascii="Optima" w:hAnsi="Optima" w:cs="Arial"/>
-        </w:rPr>
-        <w:t>[[</w:t>
+        <w:t>that [[</w:t>
       </w:r>
       <w:proofErr w:type="spellStart"/>
       <w:proofErr w:type="gramEnd"/>

</xml_diff>

<commit_message>
NOA: true right-align on Claimant/Defendant/CASE NO
</commit_message>
<xml_diff>
--- a/masters/NoticeOfActing.docx
+++ b/masters/NoticeOfActing.docx
@@ -41,10 +41,10 @@
       <w:pPr>
         <w:pStyle w:val="p2"/>
         <w:bidi w:val="0"/>
-        <w:ind w:hanging="0" w:start="6667" w:end="0"/>
-        <w:rPr>
-          <w:rFonts w:ascii="Optima" w:hAnsi="Optima" w:cs="Arial"/>
-        </w:rPr>
+        <w:rPr>
+          <w:rFonts w:ascii="Optima" w:hAnsi="Optima" w:cs="Arial"/>
+        </w:rPr>
+        <w:jc w:val="right"/>
       </w:pPr>
       <w:r>
         <w:rPr>
@@ -120,10 +120,10 @@
       <w:pPr>
         <w:pStyle w:val="p5"/>
         <w:bidi w:val="0"/>
-        <w:ind w:hanging="0" w:start="8107" w:end="0"/>
-        <w:rPr>
-          <w:rFonts w:ascii="Optima" w:hAnsi="Optima" w:cs="Arial"/>
-        </w:rPr>
+        <w:rPr>
+          <w:rFonts w:ascii="Optima" w:hAnsi="Optima" w:cs="Arial"/>
+        </w:rPr>
+        <w:jc w:val="right"/>
       </w:pPr>
       <w:r>
         <w:rPr>
@@ -213,10 +213,10 @@
       <w:pPr>
         <w:pStyle w:val="p6"/>
         <w:bidi w:val="0"/>
-        <w:ind w:hanging="0" w:start="7857" w:end="0"/>
-        <w:rPr>
-          <w:rFonts w:ascii="Optima" w:hAnsi="Optima" w:cs="Arial"/>
-        </w:rPr>
+        <w:rPr>
+          <w:rFonts w:ascii="Optima" w:hAnsi="Optima" w:cs="Arial"/>
+        </w:rPr>
+        <w:jc w:val="right"/>
       </w:pPr>
       <w:r>
         <w:rPr>

</xml_diff>